<commit_message>
Add repository link to IEEE report and PDF document
</commit_message>
<xml_diff>
--- a/informe_IEEE_driver_monitor.docx
+++ b/informe_IEEE_driver_monitor.docx
@@ -44,92 +44,133 @@
       <w:pPr>
         <w:spacing w:after="60" w:before="100" w:lineRule="auto"/>
         <w:jc w:val="center"/>
-        <w:rPr/>
-      </w:pPr>
-      <w:r>
-        <w:rPr>
-          <w:rFonts w:ascii="Times New Roman" w:cs="Times New Roman" w:eastAsia="Times New Roman" w:hAnsi="Times New Roman"/>
+        <w:rPr>
           <w:b w:val="1"/>
           <w:bCs w:val="1"/>
           <w:sz w:val="24"/>
           <w:szCs w:val="24"/>
-          <w:rtl w:val="0"/>
-        </w:rPr>
-        <w:t xml:space="preserve">Alejandro </w:t>
-      </w:r>
-      <w:r>
-        <w:rPr>
+        </w:rPr>
+      </w:pPr>
+      <w:r>
+        <w:rPr>
+          <w:rFonts w:ascii="Times New Roman" w:cs="Times New Roman" w:eastAsia="Times New Roman" w:hAnsi="Times New Roman"/>
           <w:b w:val="1"/>
           <w:bCs w:val="1"/>
           <w:sz w:val="24"/>
           <w:szCs w:val="24"/>
           <w:rtl w:val="0"/>
         </w:rPr>
-        <w:t xml:space="preserve">Munoz Franco</w:t>
-      </w:r>
-      <w:r>
-        <w:rPr>
-          <w:rFonts w:ascii="Times New Roman" w:cs="Times New Roman" w:eastAsia="Times New Roman" w:hAnsi="Times New Roman"/>
+        <w:t xml:space="preserve">Alejandro </w:t>
+      </w:r>
+      <w:r>
+        <w:rPr>
           <w:b w:val="1"/>
           <w:bCs w:val="1"/>
           <w:sz w:val="24"/>
           <w:szCs w:val="24"/>
           <w:rtl w:val="0"/>
         </w:rPr>
-        <w:t xml:space="preserve">¹  •  Nicolas </w:t>
-      </w:r>
-      <w:r>
-        <w:rPr>
+        <w:t xml:space="preserve">Munoz Franco</w:t>
+      </w:r>
+      <w:r>
+        <w:rPr>
+          <w:rFonts w:ascii="Times New Roman" w:cs="Times New Roman" w:eastAsia="Times New Roman" w:hAnsi="Times New Roman"/>
           <w:b w:val="1"/>
           <w:bCs w:val="1"/>
           <w:sz w:val="24"/>
           <w:szCs w:val="24"/>
           <w:rtl w:val="0"/>
         </w:rPr>
-        <w:t xml:space="preserve">Sanchez Tobar</w:t>
-      </w:r>
-      <w:r>
-        <w:rPr>
-          <w:rFonts w:ascii="Times New Roman" w:cs="Times New Roman" w:eastAsia="Times New Roman" w:hAnsi="Times New Roman"/>
+        <w:t xml:space="preserve">¹  •  Nicolas </w:t>
+      </w:r>
+      <w:r>
+        <w:rPr>
           <w:b w:val="1"/>
           <w:bCs w:val="1"/>
           <w:sz w:val="24"/>
           <w:szCs w:val="24"/>
           <w:rtl w:val="0"/>
         </w:rPr>
-        <w:t xml:space="preserve">¹</w:t>
-      </w:r>
-      <w:r>
-        <w:rPr>
+        <w:t xml:space="preserve">Sanchez Tobar</w:t>
+      </w:r>
+      <w:r>
+        <w:rPr>
+          <w:rFonts w:ascii="Times New Roman" w:cs="Times New Roman" w:eastAsia="Times New Roman" w:hAnsi="Times New Roman"/>
           <w:b w:val="1"/>
           <w:bCs w:val="1"/>
           <w:sz w:val="24"/>
           <w:szCs w:val="24"/>
           <w:rtl w:val="0"/>
         </w:rPr>
-        <w:t xml:space="preserve">  •  </w:t>
-      </w:r>
-      <w:r>
-        <w:rPr>
-          <w:rFonts w:ascii="Times New Roman" w:cs="Times New Roman" w:eastAsia="Times New Roman" w:hAnsi="Times New Roman"/>
+        <w:t xml:space="preserve">¹</w:t>
+      </w:r>
+      <w:r>
+        <w:rPr>
           <w:b w:val="1"/>
           <w:bCs w:val="1"/>
           <w:sz w:val="24"/>
           <w:szCs w:val="24"/>
           <w:rtl w:val="0"/>
         </w:rPr>
-        <w:t xml:space="preserve">Samuel Sal</w:t>
-      </w:r>
-      <w:r>
-        <w:rPr>
+        <w:t xml:space="preserve">  •  </w:t>
+      </w:r>
+      <w:r>
+        <w:rPr>
+          <w:rFonts w:ascii="Times New Roman" w:cs="Times New Roman" w:eastAsia="Times New Roman" w:hAnsi="Times New Roman"/>
           <w:b w:val="1"/>
           <w:bCs w:val="1"/>
           <w:sz w:val="24"/>
           <w:szCs w:val="24"/>
           <w:rtl w:val="0"/>
         </w:rPr>
+        <w:t xml:space="preserve">Samuel Sal</w:t>
+      </w:r>
+      <w:r>
+        <w:rPr>
+          <w:b w:val="1"/>
+          <w:bCs w:val="1"/>
+          <w:sz w:val="24"/>
+          <w:szCs w:val="24"/>
+          <w:rtl w:val="0"/>
+        </w:rPr>
         <w:t xml:space="preserve">azar¹</w:t>
       </w:r>
+    </w:p>
+    <w:p>
+      <w:pPr>
+        <w:spacing w:after="60" w:before="100" w:lineRule="auto"/>
+        <w:jc w:val="center"/>
+        <w:rPr>
+          <w:b w:val="1"/>
+          <w:bCs w:val="1"/>
+          <w:sz w:val="24"/>
+          <w:szCs w:val="24"/>
+        </w:rPr>
+      </w:pPr>
+      <w:r>
+        <w:rPr>
+          <w:b w:val="1"/>
+          <w:bCs w:val="1"/>
+          <w:sz w:val="24"/>
+          <w:szCs w:val="24"/>
+          <w:rtl w:val="0"/>
+        </w:rPr>
+        <w:t xml:space="preserve">Repositorio: </w:t>
+      </w:r>
+      <w:hyperlink r:id="rId7">
+        <w:r>
+          <w:rPr>
+            <w:b w:val="1"/>
+            <w:bCs w:val="1"/>
+            <w:color w:val="1155cc"/>
+            <w:sz w:val="24"/>
+            <w:szCs w:val="24"/>
+            <w:u w:val="single"/>
+            <w:rtl w:val="0"/>
+          </w:rPr>
+          <w:t xml:space="preserve">https://github.com/Nico4all/AI_driver_monitor.git</w:t>
+        </w:r>
+      </w:hyperlink>
       <w:r>
         <w:rPr>
           <w:rtl w:val="0"/>
@@ -7600,8 +7641,8 @@
       </w:r>
     </w:p>
     <w:sectPr>
-      <w:headerReference r:id="rId7" w:type="default"/>
-      <w:footerReference r:id="rId8" w:type="default"/>
+      <w:headerReference r:id="rId8" w:type="default"/>
+      <w:footerReference r:id="rId9" w:type="default"/>
       <w:pgSz w:h="15840" w:w="12240" w:orient="portrait"/>
       <w:pgMar w:bottom="1440" w:top="1440" w:left="1440" w:right="1440" w:header="708" w:footer="708"/>
       <w:pgNumType w:start="1"/>

</xml_diff>